<commit_message>
docs: record activity validation against latest prod
</commit_message>
<xml_diff>
--- a/docs/updates/2026-10-08_SOH_변경기록_활동지표.docx
+++ b/docs/updates/2026-10-08_SOH_변경기록_활동지표.docx
@@ -12,7 +12,7 @@
     </w:p>
     <w:p>
       <w:r>
-        <w:t>2026-10-08 | 기준 prod 65f52c2 | 운영 서울 리전</w:t>
+        <w:t>2026-10-08 | 기준 prod 505f4fb (원격 잔액 조회 변경 보존) | 운영 서울 리전</w:t>
       </w:r>
     </w:p>
     <w:p>
@@ -64,7 +64,7 @@
     </w:p>
     <w:p>
       <w:r>
-        <w:t>Java 17 전체 503개/94 suite, 실패·오류·생략 0 및 bootJar 통과. 실제 기존 JWT 필터의 위조·만료·삭제·폐기 세션, 관리자/일반 분리, 업무 오류와 가명 계약을 검증했다. 기존 Asciidoctor 누락 snippet 경고는 남아 있다. FE 계약 변경이 없어 FE 수정·시험은 제외한다.</w:t>
+        <w:t>Java 17 전체 521개/97 suite, 실패·오류·생략 0 및 bootJar 통과. 실제 기존 JWT 필터의 위조·만료·삭제·폐기 세션, 관리자/일반 분리, 업무 오류와 가명 계약을 검증했다. 기존 Asciidoctor 누락 snippet 경고는 남아 있다. FE 계약 변경이 없어 FE 수정·시험은 제외한다.</w:t>
       </w:r>
     </w:p>
     <w:p>

</xml_diff>